<commit_message>
Update Sales Script and Onboarding Package with new CRM plan names and prices
</commit_message>
<xml_diff>
--- a/document/bluwav-sales-script/document.docx
+++ b/document/bluwav-sales-script/document.docx
@@ -149,7 +149,7 @@
           <w:sz w:val="24"/>
           <w:szCs w:val="24"/>
         </w:rPr>
-        <w:t xml:space="preserve">Updated to reflect BluWav Growth's current global positioning: tagline “Get Found. Get Chosen. Grow.”, three Growth Systems (Ripple / Current / Surge), five CRM tiers (Starter / Lite / Premium / Enterprise / White-Label), 14-day free CRM trial included in every plan, Health Check results delivered within 24 hours, global audience focus (no Caribbean-specific language), and updated objection responses throughout.</w:t>
+        <w:t xml:space="preserve">Updated to reflect BluWav Growth's current global positioning: tagline “Get Found. Get Chosen. Grow.”, three Growth Systems (Ripple / Current / Surge), five CRM tiers (Starter / Lite / Premium / Enterprise / Agency Edition™), 14-day free CRM trial included in every plan, Health Check results delivered within 24 hours, global audience focus (no Caribbean-specific language), and updated objection responses throughout.</w:t>
       </w:r>
     </w:p>
     <w:p>
@@ -741,7 +741,7 @@
           <w:sz w:val="24"/>
           <w:szCs w:val="24"/>
         </w:rPr>
-        <w:t xml:space="preserve">CRM Starter: </w:t>
+        <w:t xml:space="preserve">Foundation Plan™: </w:t>
       </w:r>
       <w:r>
         <w:rPr>
@@ -768,7 +768,7 @@
           <w:sz w:val="24"/>
           <w:szCs w:val="24"/>
         </w:rPr>
-        <w:t xml:space="preserve">CRM Lite: </w:t>
+        <w:t xml:space="preserve">Growth Plan™: </w:t>
       </w:r>
       <w:r>
         <w:rPr>
@@ -795,15 +795,15 @@
           <w:sz w:val="24"/>
           <w:szCs w:val="24"/>
         </w:rPr>
-        <w:t xml:space="preserve">CRM Premium: </w:t>
-      </w:r>
-      <w:r>
-        <w:rPr>
-          <w:rFonts w:ascii="Cambria" w:cs="Cambria" w:eastAsia="Cambria" w:hAnsi="Cambria"/>
-          <w:sz w:val="24"/>
-          <w:szCs w:val="24"/>
-        </w:rPr>
-        <w:t xml:space="preserve">$179/mo + $299 onboarding. Unlimited contacts, full pipeline, WhatsApp integration, 5 team members. Introductory rate — locks in for life.</w:t>
+        <w:t xml:space="preserve">Founder Plan™: </w:t>
+      </w:r>
+      <w:r>
+        <w:rPr>
+          <w:rFonts w:ascii="Cambria" w:cs="Cambria" w:eastAsia="Cambria" w:hAnsi="Cambria"/>
+          <w:sz w:val="24"/>
+          <w:szCs w:val="24"/>
+        </w:rPr>
+        <w:t xml:space="preserve">$199/mo + $299 onboarding. Unlimited contacts, full pipeline, WhatsApp integration, 5 team members. Introductory rate — locks in for life.</w:t>
       </w:r>
     </w:p>
     <w:p>
@@ -822,15 +822,15 @@
           <w:sz w:val="24"/>
           <w:szCs w:val="24"/>
         </w:rPr>
-        <w:t xml:space="preserve">CRM Enterprise: </w:t>
-      </w:r>
-      <w:r>
-        <w:rPr>
-          <w:rFonts w:ascii="Cambria" w:cs="Cambria" w:eastAsia="Cambria" w:hAnsi="Cambria"/>
-          <w:sz w:val="24"/>
-          <w:szCs w:val="24"/>
-        </w:rPr>
-        <w:t xml:space="preserve">$499/mo + $599 onboarding. Unlimited team, custom workflows, API access, dedicated account manager.</w:t>
+        <w:t xml:space="preserve">Enterprise Plan™: </w:t>
+      </w:r>
+      <w:r>
+        <w:rPr>
+          <w:rFonts w:ascii="Cambria" w:cs="Cambria" w:eastAsia="Cambria" w:hAnsi="Cambria"/>
+          <w:sz w:val="24"/>
+          <w:szCs w:val="24"/>
+        </w:rPr>
+        <w:t xml:space="preserve">$399/mo + $599 onboarding. Unlimited team, custom workflows, API access, dedicated account manager.</w:t>
       </w:r>
     </w:p>
     <w:p>
@@ -849,15 +849,15 @@
           <w:sz w:val="24"/>
           <w:szCs w:val="24"/>
         </w:rPr>
-        <w:t xml:space="preserve">White-Label: </w:t>
-      </w:r>
-      <w:r>
-        <w:rPr>
-          <w:rFonts w:ascii="Cambria" w:cs="Cambria" w:eastAsia="Cambria" w:hAnsi="Cambria"/>
-          <w:sz w:val="24"/>
-          <w:szCs w:val="24"/>
-        </w:rPr>
-        <w:t xml:space="preserve">$697/mo + $699 onboarding. For agencies — your brand, unlimited client accounts.</w:t>
+        <w:t xml:space="preserve">Agency Edition™: </w:t>
+      </w:r>
+      <w:r>
+        <w:rPr>
+          <w:rFonts w:ascii="Cambria" w:cs="Cambria" w:eastAsia="Cambria" w:hAnsi="Cambria"/>
+          <w:sz w:val="24"/>
+          <w:szCs w:val="24"/>
+        </w:rPr>
+        <w:t xml:space="preserve">$899/mo + $699 onboarding. For agencies — your brand, unlimited client accounts.</w:t>
       </w:r>
     </w:p>
     <w:p>

</xml_diff>